<commit_message>
Bao cao: khoang cach dong Multiple 1.3, style Caption + DANH SACH HINH (field tuong tu muc luc), dung so trang that (25 trang), xoa anh orphan
</commit_message>
<xml_diff>
--- a/BaoCao_DevOps_Moi.docx
+++ b/BaoCao_DevOps_Moi.docx
@@ -272,11 +272,21 @@
           <w:b/>
           <w:sz w:val="26"/>
         </w:rPr>
-        <w:t>CHƯƠNG 1. GIỚI THIỆU</w:t>
-      </w:r>
-      <w:r>
+        <w:t xml:space="preserve">CHƯƠNG 1. GIỚI THIỆU</w:t>
+      </w:r>
+      <w:r>
+        <w:rPr>
+          <w:b/>
+          <w:sz w:val="26"/>
+        </w:rPr>
         <w:tab/>
-        <w:t>3</w:t>
+      </w:r>
+      <w:r>
+        <w:rPr>
+          <w:b/>
+          <w:sz w:val="26"/>
+        </w:rPr>
+        <w:t xml:space="preserve">3</w:t>
       </w:r>
     </w:p>
     <w:p>
@@ -292,11 +302,21 @@
           <w:b w:val="0"/>
           <w:sz w:val="26"/>
         </w:rPr>
-        <w:t>1.1. Bối cảnh và lý do thực hiện</w:t>
-      </w:r>
-      <w:r>
+        <w:t xml:space="preserve">1.1. Bối cảnh và lý do thực hiện</w:t>
+      </w:r>
+      <w:r>
+        <w:rPr>
+          <w:b w:val="0"/>
+          <w:sz w:val="26"/>
+        </w:rPr>
         <w:tab/>
-        <w:t>3</w:t>
+      </w:r>
+      <w:r>
+        <w:rPr>
+          <w:b w:val="0"/>
+          <w:sz w:val="26"/>
+        </w:rPr>
+        <w:t xml:space="preserve">3</w:t>
       </w:r>
     </w:p>
     <w:p>
@@ -312,11 +332,21 @@
           <w:b w:val="0"/>
           <w:sz w:val="26"/>
         </w:rPr>
-        <w:t>1.2. Mục tiêu</w:t>
-      </w:r>
-      <w:r>
+        <w:t xml:space="preserve">1.2. Mục tiêu</w:t>
+      </w:r>
+      <w:r>
+        <w:rPr>
+          <w:b w:val="0"/>
+          <w:sz w:val="26"/>
+        </w:rPr>
         <w:tab/>
-        <w:t>3</w:t>
+      </w:r>
+      <w:r>
+        <w:rPr>
+          <w:b w:val="0"/>
+          <w:sz w:val="26"/>
+        </w:rPr>
+        <w:t xml:space="preserve">3</w:t>
       </w:r>
     </w:p>
     <w:p>
@@ -332,11 +362,21 @@
           <w:b w:val="0"/>
           <w:sz w:val="26"/>
         </w:rPr>
-        <w:t>1.3. Phạm vi và nội dung thực hiện</w:t>
-      </w:r>
-      <w:r>
+        <w:t xml:space="preserve">1.3. Phạm vi và nội dung thực hiện</w:t>
+      </w:r>
+      <w:r>
+        <w:rPr>
+          <w:b w:val="0"/>
+          <w:sz w:val="26"/>
+        </w:rPr>
         <w:tab/>
-        <w:t>3</w:t>
+      </w:r>
+      <w:r>
+        <w:rPr>
+          <w:b w:val="0"/>
+          <w:sz w:val="26"/>
+        </w:rPr>
+        <w:t xml:space="preserve">3</w:t>
       </w:r>
     </w:p>
     <w:p>
@@ -352,11 +392,21 @@
           <w:b/>
           <w:sz w:val="26"/>
         </w:rPr>
-        <w:t>CHƯƠNG 2. CƠ SỞ LÝ THUYẾT</w:t>
-      </w:r>
-      <w:r>
+        <w:t xml:space="preserve">CHƯƠNG 2. CƠ SỞ LÝ THUYẾT</w:t>
+      </w:r>
+      <w:r>
+        <w:rPr>
+          <w:b/>
+          <w:sz w:val="26"/>
+        </w:rPr>
         <w:tab/>
-        <w:t>4</w:t>
+      </w:r>
+      <w:r>
+        <w:rPr>
+          <w:b/>
+          <w:sz w:val="26"/>
+        </w:rPr>
+        <w:t xml:space="preserve">4</w:t>
       </w:r>
     </w:p>
     <w:p>
@@ -372,11 +422,21 @@
           <w:b w:val="0"/>
           <w:sz w:val="26"/>
         </w:rPr>
-        <w:t>2.1. DevOps và CI/CD</w:t>
-      </w:r>
-      <w:r>
+        <w:t xml:space="preserve">2.1. DevOps và CI/CD</w:t>
+      </w:r>
+      <w:r>
+        <w:rPr>
+          <w:b w:val="0"/>
+          <w:sz w:val="26"/>
+        </w:rPr>
         <w:tab/>
-        <w:t>4</w:t>
+      </w:r>
+      <w:r>
+        <w:rPr>
+          <w:b w:val="0"/>
+          <w:sz w:val="26"/>
+        </w:rPr>
+        <w:t xml:space="preserve">4</w:t>
       </w:r>
     </w:p>
     <w:p>
@@ -392,11 +452,21 @@
           <w:b w:val="0"/>
           <w:sz w:val="26"/>
         </w:rPr>
-        <w:t>2.2. WSL – Windows Subsystem for Linux</w:t>
-      </w:r>
-      <w:r>
+        <w:t xml:space="preserve">2.2. WSL – Windows Subsystem for Linux</w:t>
+      </w:r>
+      <w:r>
+        <w:rPr>
+          <w:b w:val="0"/>
+          <w:sz w:val="26"/>
+        </w:rPr>
         <w:tab/>
-        <w:t>4</w:t>
+      </w:r>
+      <w:r>
+        <w:rPr>
+          <w:b w:val="0"/>
+          <w:sz w:val="26"/>
+        </w:rPr>
+        <w:t xml:space="preserve">4</w:t>
       </w:r>
     </w:p>
     <w:p>
@@ -412,11 +482,21 @@
           <w:b w:val="0"/>
           <w:sz w:val="26"/>
         </w:rPr>
-        <w:t>2.3. SSH – Secure Shell</w:t>
-      </w:r>
-      <w:r>
+        <w:t xml:space="preserve">2.3. SSH – Secure Shell</w:t>
+      </w:r>
+      <w:r>
+        <w:rPr>
+          <w:b w:val="0"/>
+          <w:sz w:val="26"/>
+        </w:rPr>
         <w:tab/>
-        <w:t>4</w:t>
+      </w:r>
+      <w:r>
+        <w:rPr>
+          <w:b w:val="0"/>
+          <w:sz w:val="26"/>
+        </w:rPr>
+        <w:t xml:space="preserve">4</w:t>
       </w:r>
     </w:p>
     <w:p>
@@ -432,11 +512,21 @@
           <w:b w:val="0"/>
           <w:sz w:val="26"/>
         </w:rPr>
-        <w:t>2.4. Docker và container</w:t>
-      </w:r>
-      <w:r>
+        <w:t xml:space="preserve">2.4. Docker và container</w:t>
+      </w:r>
+      <w:r>
+        <w:rPr>
+          <w:b w:val="0"/>
+          <w:sz w:val="26"/>
+        </w:rPr>
         <w:tab/>
-        <w:t>4</w:t>
+      </w:r>
+      <w:r>
+        <w:rPr>
+          <w:b w:val="0"/>
+          <w:sz w:val="26"/>
+        </w:rPr>
+        <w:t xml:space="preserve">4</w:t>
       </w:r>
     </w:p>
     <w:p>
@@ -452,11 +542,21 @@
           <w:b w:val="0"/>
           <w:sz w:val="26"/>
         </w:rPr>
-        <w:t>2.5. Jenkins</w:t>
-      </w:r>
-      <w:r>
+        <w:t xml:space="preserve">2.5. Jenkins</w:t>
+      </w:r>
+      <w:r>
+        <w:rPr>
+          <w:b w:val="0"/>
+          <w:sz w:val="26"/>
+        </w:rPr>
         <w:tab/>
-        <w:t>4</w:t>
+      </w:r>
+      <w:r>
+        <w:rPr>
+          <w:b w:val="0"/>
+          <w:sz w:val="26"/>
+        </w:rPr>
+        <w:t xml:space="preserve">5</w:t>
       </w:r>
     </w:p>
     <w:p>
@@ -472,11 +572,21 @@
           <w:b/>
           <w:sz w:val="26"/>
         </w:rPr>
-        <w:t>CHƯƠNG 3. MÔI TRƯỜNG THỰC HIỆN</w:t>
-      </w:r>
-      <w:r>
+        <w:t xml:space="preserve">CHƯƠNG 3. MÔI TRƯỜNG THỰC HIỆN</w:t>
+      </w:r>
+      <w:r>
+        <w:rPr>
+          <w:b/>
+          <w:sz w:val="26"/>
+        </w:rPr>
         <w:tab/>
-        <w:t>5</w:t>
+      </w:r>
+      <w:r>
+        <w:rPr>
+          <w:b/>
+          <w:sz w:val="26"/>
+        </w:rPr>
+        <w:t xml:space="preserve">6</w:t>
       </w:r>
     </w:p>
     <w:p>
@@ -492,11 +602,21 @@
           <w:b/>
           <w:sz w:val="26"/>
         </w:rPr>
-        <w:t>CHƯƠNG 4. TRIỂN KHAI THỰC HIỆN</w:t>
-      </w:r>
-      <w:r>
+        <w:t xml:space="preserve">CHƯƠNG 4. TRIỂN KHAI THỰC HIỆN</w:t>
+      </w:r>
+      <w:r>
+        <w:rPr>
+          <w:b/>
+          <w:sz w:val="26"/>
+        </w:rPr>
         <w:tab/>
-        <w:t>6</w:t>
+      </w:r>
+      <w:r>
+        <w:rPr>
+          <w:b/>
+          <w:sz w:val="26"/>
+        </w:rPr>
+        <w:t xml:space="preserve">7</w:t>
       </w:r>
     </w:p>
     <w:p>
@@ -512,11 +632,21 @@
           <w:b w:val="0"/>
           <w:sz w:val="26"/>
         </w:rPr>
-        <w:t>4.1. Kiểm chứng Ubuntu trên WSL</w:t>
-      </w:r>
-      <w:r>
+        <w:t xml:space="preserve">4.1. Kiểm chứng Ubuntu trên WSL</w:t>
+      </w:r>
+      <w:r>
+        <w:rPr>
+          <w:b w:val="0"/>
+          <w:sz w:val="26"/>
+        </w:rPr>
         <w:tab/>
-        <w:t>6</w:t>
+      </w:r>
+      <w:r>
+        <w:rPr>
+          <w:b w:val="0"/>
+          <w:sz w:val="26"/>
+        </w:rPr>
+        <w:t xml:space="preserve">7</w:t>
       </w:r>
     </w:p>
     <w:p>
@@ -532,11 +662,21 @@
           <w:b w:val="0"/>
           <w:sz w:val="26"/>
         </w:rPr>
-        <w:t>4.2. Kiểm tra kết nối SSH từ Ubuntu tới Windows</w:t>
-      </w:r>
-      <w:r>
+        <w:t xml:space="preserve">4.2. Kiểm tra kết nối SSH từ Ubuntu tới Windows</w:t>
+      </w:r>
+      <w:r>
+        <w:rPr>
+          <w:b w:val="0"/>
+          <w:sz w:val="26"/>
+        </w:rPr>
         <w:tab/>
-        <w:t>6</w:t>
+      </w:r>
+      <w:r>
+        <w:rPr>
+          <w:b w:val="0"/>
+          <w:sz w:val="26"/>
+        </w:rPr>
+        <w:t xml:space="preserve">8</w:t>
       </w:r>
     </w:p>
     <w:p>
@@ -552,11 +692,21 @@
           <w:b w:val="0"/>
           <w:sz w:val="26"/>
         </w:rPr>
-        <w:t>4.3. Sử dụng lệnh và tạo file với Docker</w:t>
-      </w:r>
-      <w:r>
+        <w:t xml:space="preserve">4.3. Sử dụng lệnh và tạo file với Docker</w:t>
+      </w:r>
+      <w:r>
+        <w:rPr>
+          <w:b w:val="0"/>
+          <w:sz w:val="26"/>
+        </w:rPr>
         <w:tab/>
-        <w:t>6</w:t>
+      </w:r>
+      <w:r>
+        <w:rPr>
+          <w:b w:val="0"/>
+          <w:sz w:val="26"/>
+        </w:rPr>
+        <w:t xml:space="preserve">10</w:t>
       </w:r>
     </w:p>
     <w:p>
@@ -572,11 +722,21 @@
           <w:b w:val="0"/>
           <w:sz w:val="26"/>
         </w:rPr>
-        <w:t>4.4. Chạy pipeline Jenkins cho dự án</w:t>
-      </w:r>
-      <w:r>
+        <w:t xml:space="preserve">4.4. Chạy pipeline Jenkins cho dự án</w:t>
+      </w:r>
+      <w:r>
+        <w:rPr>
+          <w:b w:val="0"/>
+          <w:sz w:val="26"/>
+        </w:rPr>
         <w:tab/>
-        <w:t>6</w:t>
+      </w:r>
+      <w:r>
+        <w:rPr>
+          <w:b w:val="0"/>
+          <w:sz w:val="26"/>
+        </w:rPr>
+        <w:t xml:space="preserve">13</w:t>
       </w:r>
     </w:p>
     <w:p>
@@ -592,11 +752,21 @@
           <w:b/>
           <w:sz w:val="26"/>
         </w:rPr>
-        <w:t>CHƯƠNG 5. ĐÁNH GIÁ VÀ KẾT LUẬN</w:t>
-      </w:r>
-      <w:r>
+        <w:t xml:space="preserve">CHƯƠNG 5. ĐÁNH GIÁ VÀ KẾT LUẬN</w:t>
+      </w:r>
+      <w:r>
+        <w:rPr>
+          <w:b/>
+          <w:sz w:val="26"/>
+        </w:rPr>
         <w:tab/>
-        <w:t>7</w:t>
+      </w:r>
+      <w:r>
+        <w:rPr>
+          <w:b/>
+          <w:sz w:val="26"/>
+        </w:rPr>
+        <w:t xml:space="preserve">22</w:t>
       </w:r>
     </w:p>
     <w:p>
@@ -612,11 +782,21 @@
           <w:b w:val="0"/>
           <w:sz w:val="26"/>
         </w:rPr>
-        <w:t>5.1. Kết quả đạt được</w:t>
-      </w:r>
-      <w:r>
+        <w:t xml:space="preserve">5.1. Kết quả đạt được</w:t>
+      </w:r>
+      <w:r>
+        <w:rPr>
+          <w:b w:val="0"/>
+          <w:sz w:val="26"/>
+        </w:rPr>
         <w:tab/>
-        <w:t>7</w:t>
+      </w:r>
+      <w:r>
+        <w:rPr>
+          <w:b w:val="0"/>
+          <w:sz w:val="26"/>
+        </w:rPr>
+        <w:t xml:space="preserve">22</w:t>
       </w:r>
     </w:p>
     <w:p>
@@ -632,11 +812,21 @@
           <w:b w:val="0"/>
           <w:sz w:val="26"/>
         </w:rPr>
-        <w:t>5.2. Một số lưu ý và cách xử lý</w:t>
-      </w:r>
-      <w:r>
+        <w:t xml:space="preserve">5.2. Một số lưu ý và cách xử lý</w:t>
+      </w:r>
+      <w:r>
+        <w:rPr>
+          <w:b w:val="0"/>
+          <w:sz w:val="26"/>
+        </w:rPr>
         <w:tab/>
-        <w:t>7</w:t>
+      </w:r>
+      <w:r>
+        <w:rPr>
+          <w:b w:val="0"/>
+          <w:sz w:val="26"/>
+        </w:rPr>
+        <w:t xml:space="preserve">22</w:t>
       </w:r>
     </w:p>
     <w:p>
@@ -652,11 +842,21 @@
           <w:b w:val="0"/>
           <w:sz w:val="26"/>
         </w:rPr>
-        <w:t>5.3. Hướng phát triển</w:t>
-      </w:r>
-      <w:r>
+        <w:t xml:space="preserve">5.3. Hướng phát triển</w:t>
+      </w:r>
+      <w:r>
+        <w:rPr>
+          <w:b w:val="0"/>
+          <w:sz w:val="26"/>
+        </w:rPr>
         <w:tab/>
-        <w:t>7</w:t>
+      </w:r>
+      <w:r>
+        <w:rPr>
+          <w:b w:val="0"/>
+          <w:sz w:val="26"/>
+        </w:rPr>
+        <w:t xml:space="preserve">23</w:t>
       </w:r>
     </w:p>
     <w:p>
@@ -672,11 +872,21 @@
           <w:b w:val="0"/>
           <w:sz w:val="26"/>
         </w:rPr>
-        <w:t>5.4. Kết luận</w:t>
-      </w:r>
-      <w:r>
+        <w:t xml:space="preserve">5.4. Kết luận</w:t>
+      </w:r>
+      <w:r>
+        <w:rPr>
+          <w:b w:val="0"/>
+          <w:sz w:val="26"/>
+        </w:rPr>
         <w:tab/>
-        <w:t>7</w:t>
+      </w:r>
+      <w:r>
+        <w:rPr>
+          <w:b w:val="0"/>
+          <w:sz w:val="26"/>
+        </w:rPr>
+        <w:t xml:space="preserve">23</w:t>
       </w:r>
     </w:p>
     <w:p>
@@ -692,14 +902,435 @@
           <w:b/>
           <w:sz w:val="26"/>
         </w:rPr>
-        <w:t>TÀI LIỆU THAM KHẢO</w:t>
+        <w:t xml:space="preserve">TÀI LIỆU THAM KHẢO</w:t>
+      </w:r>
+      <w:r>
+        <w:rPr>
+          <w:b/>
+          <w:sz w:val="26"/>
+        </w:rPr>
+        <w:tab/>
+      </w:r>
+      <w:r>
+        <w:rPr>
+          <w:b/>
+          <w:sz w:val="26"/>
+        </w:rPr>
+        <w:t xml:space="preserve">25</w:t>
       </w:r>
       <w:r>
         <w:fldChar w:fldCharType="end"/>
       </w:r>
-      <w:r>
+    </w:p>
+    <w:p>
+      <w:pPr>
+        <w:pStyle w:val="Heading1"/>
+        <w:outlineLvl w:val="9"/>
+      </w:pPr>
+      <w:r>
+        <w:t>DANH SÁCH HÌNH</w:t>
+      </w:r>
+    </w:p>
+    <w:p>
+      <w:pPr>
+        <w:tabs>
+          <w:tab w:val="right" w:leader="dot" w:pos="9072"/>
+        </w:tabs>
+        <w:spacing w:after="40"/>
+        <w:ind w:firstLine="0"/>
+      </w:pPr>
+      <w:r>
+        <w:fldChar w:fldCharType="begin"/>
+      </w:r>
+      <w:r>
+        <w:instrText xml:space="preserve"> TOC \h \z \t "Caption,1" </w:instrText>
+      </w:r>
+      <w:r>
+        <w:fldChar w:fldCharType="separate"/>
+      </w:r>
+      <w:r>
+        <w:rPr>
+          <w:b w:val="0"/>
+          <w:sz w:val="26"/>
+        </w:rPr>
+        <w:t xml:space="preserve">Hình 4.1. Kiểm tra WSL và phiên làm việc Ubuntu (tài khoản phuoctoan)</w:t>
+      </w:r>
+      <w:r>
+        <w:rPr>
+          <w:b w:val="0"/>
+          <w:sz w:val="26"/>
+        </w:rPr>
         <w:tab/>
-        <w:t>8</w:t>
+      </w:r>
+      <w:r>
+        <w:rPr>
+          <w:b w:val="0"/>
+          <w:sz w:val="26"/>
+        </w:rPr>
+        <w:t xml:space="preserve">7</w:t>
+      </w:r>
+    </w:p>
+    <w:p>
+      <w:pPr>
+        <w:tabs>
+          <w:tab w:val="right" w:leader="dot" w:pos="9072"/>
+        </w:tabs>
+        <w:spacing w:after="40"/>
+        <w:ind w:firstLine="0"/>
+      </w:pPr>
+      <w:r>
+        <w:rPr>
+          <w:b w:val="0"/>
+          <w:sz w:val="26"/>
+        </w:rPr>
+        <w:t xml:space="preserve">Hình 4.2. Ngày giờ, địa chỉ mạng, ổ đĩa và bộ nhớ của Ubuntu</w:t>
+      </w:r>
+      <w:r>
+        <w:rPr>
+          <w:b w:val="0"/>
+          <w:sz w:val="26"/>
+        </w:rPr>
+        <w:tab/>
+      </w:r>
+      <w:r>
+        <w:rPr>
+          <w:b w:val="0"/>
+          <w:sz w:val="26"/>
+        </w:rPr>
+        <w:t xml:space="preserve">8</w:t>
+      </w:r>
+    </w:p>
+    <w:p>
+      <w:pPr>
+        <w:tabs>
+          <w:tab w:val="right" w:leader="dot" w:pos="9072"/>
+        </w:tabs>
+        <w:spacing w:after="40"/>
+        <w:ind w:firstLine="0"/>
+      </w:pPr>
+      <w:r>
+        <w:rPr>
+          <w:b w:val="0"/>
+          <w:sz w:val="26"/>
+        </w:rPr>
+        <w:t xml:space="preserve">Hình 4.3. SSH từ Ubuntu vào Windows thành công (admin@172.27.16.1)</w:t>
+      </w:r>
+      <w:r>
+        <w:rPr>
+          <w:b w:val="0"/>
+          <w:sz w:val="26"/>
+        </w:rPr>
+        <w:tab/>
+      </w:r>
+      <w:r>
+        <w:rPr>
+          <w:b w:val="0"/>
+          <w:sz w:val="26"/>
+        </w:rPr>
+        <w:t xml:space="preserve">9</w:t>
+      </w:r>
+    </w:p>
+    <w:p>
+      <w:pPr>
+        <w:tabs>
+          <w:tab w:val="right" w:leader="dot" w:pos="9072"/>
+        </w:tabs>
+        <w:spacing w:after="40"/>
+        <w:ind w:firstLine="0"/>
+      </w:pPr>
+      <w:r>
+        <w:rPr>
+          <w:b w:val="0"/>
+          <w:sz w:val="26"/>
+        </w:rPr>
+        <w:t xml:space="preserve">Hình 4.4. Tải image alpine và khởi chạy container tên “toan”</w:t>
+      </w:r>
+      <w:r>
+        <w:rPr>
+          <w:b w:val="0"/>
+          <w:sz w:val="26"/>
+        </w:rPr>
+        <w:tab/>
+      </w:r>
+      <w:r>
+        <w:rPr>
+          <w:b w:val="0"/>
+          <w:sz w:val="26"/>
+        </w:rPr>
+        <w:t xml:space="preserve">10</w:t>
+      </w:r>
+    </w:p>
+    <w:p>
+      <w:pPr>
+        <w:tabs>
+          <w:tab w:val="right" w:leader="dot" w:pos="9072"/>
+        </w:tabs>
+        <w:spacing w:after="40"/>
+        <w:ind w:firstLine="0"/>
+      </w:pPr>
+      <w:r>
+        <w:rPr>
+          <w:b w:val="0"/>
+          <w:sz w:val="26"/>
+        </w:rPr>
+        <w:t xml:space="preserve">Hình 4.5. Liệt kê thư mục gốc, tạo thư mục baocao và file hello.txt</w:t>
+      </w:r>
+      <w:r>
+        <w:rPr>
+          <w:b w:val="0"/>
+          <w:sz w:val="26"/>
+        </w:rPr>
+        <w:tab/>
+      </w:r>
+      <w:r>
+        <w:rPr>
+          <w:b w:val="0"/>
+          <w:sz w:val="26"/>
+        </w:rPr>
+        <w:t xml:space="preserve">12</w:t>
+      </w:r>
+    </w:p>
+    <w:p>
+      <w:pPr>
+        <w:tabs>
+          <w:tab w:val="right" w:leader="dot" w:pos="9072"/>
+        </w:tabs>
+        <w:spacing w:after="40"/>
+        <w:ind w:firstLine="0"/>
+      </w:pPr>
+      <w:r>
+        <w:rPr>
+          <w:b w:val="0"/>
+          <w:sz w:val="26"/>
+        </w:rPr>
+        <w:t xml:space="preserve">Hình 4.6. Kho mã nguồn DevOPS-26-13 trên GitHub (public, nhánh master)</w:t>
+      </w:r>
+      <w:r>
+        <w:rPr>
+          <w:b w:val="0"/>
+          <w:sz w:val="26"/>
+        </w:rPr>
+        <w:tab/>
+      </w:r>
+      <w:r>
+        <w:rPr>
+          <w:b w:val="0"/>
+          <w:sz w:val="26"/>
+        </w:rPr>
+        <w:t xml:space="preserve">13</w:t>
+      </w:r>
+    </w:p>
+    <w:p>
+      <w:pPr>
+        <w:tabs>
+          <w:tab w:val="right" w:leader="dot" w:pos="9072"/>
+        </w:tabs>
+        <w:spacing w:after="40"/>
+        <w:ind w:firstLine="0"/>
+      </w:pPr>
+      <w:r>
+        <w:rPr>
+          <w:b w:val="0"/>
+          <w:sz w:val="26"/>
+        </w:rPr>
+        <w:t xml:space="preserve">Hình 4.7. Dashboard Jenkins: job devops-26-13-cicd, Last Success #4</w:t>
+      </w:r>
+      <w:r>
+        <w:rPr>
+          <w:b w:val="0"/>
+          <w:sz w:val="26"/>
+        </w:rPr>
+        <w:tab/>
+      </w:r>
+      <w:r>
+        <w:rPr>
+          <w:b w:val="0"/>
+          <w:sz w:val="26"/>
+        </w:rPr>
+        <w:t xml:space="preserve">14</w:t>
+      </w:r>
+    </w:p>
+    <w:p>
+      <w:pPr>
+        <w:tabs>
+          <w:tab w:val="right" w:leader="dot" w:pos="9072"/>
+        </w:tabs>
+        <w:spacing w:after="40"/>
+        <w:ind w:firstLine="0"/>
+      </w:pPr>
+      <w:r>
+        <w:rPr>
+          <w:b w:val="0"/>
+          <w:sz w:val="26"/>
+        </w:rPr>
+        <w:t xml:space="preserve">Hình 4.8. Trang job devops-26-13-cicd với lịch sử build #1–#4</w:t>
+      </w:r>
+      <w:r>
+        <w:rPr>
+          <w:b w:val="0"/>
+          <w:sz w:val="26"/>
+        </w:rPr>
+        <w:tab/>
+      </w:r>
+      <w:r>
+        <w:rPr>
+          <w:b w:val="0"/>
+          <w:sz w:val="26"/>
+        </w:rPr>
+        <w:t xml:space="preserve">14</w:t>
+      </w:r>
+    </w:p>
+    <w:p>
+      <w:pPr>
+        <w:tabs>
+          <w:tab w:val="right" w:leader="dot" w:pos="9072"/>
+        </w:tabs>
+        <w:spacing w:after="40"/>
+        <w:ind w:firstLine="0"/>
+      </w:pPr>
+      <w:r>
+        <w:rPr>
+          <w:b w:val="0"/>
+          <w:sz w:val="26"/>
+        </w:rPr>
+        <w:t xml:space="preserve">Hình 4.9. Kết quả 8/8 smoke test trong console log của build #3</w:t>
+      </w:r>
+      <w:r>
+        <w:rPr>
+          <w:b w:val="0"/>
+          <w:sz w:val="26"/>
+        </w:rPr>
+        <w:tab/>
+      </w:r>
+      <w:r>
+        <w:rPr>
+          <w:b w:val="0"/>
+          <w:sz w:val="26"/>
+        </w:rPr>
+        <w:t xml:space="preserve">15</w:t>
+      </w:r>
+    </w:p>
+    <w:p>
+      <w:pPr>
+        <w:tabs>
+          <w:tab w:val="right" w:leader="dot" w:pos="9072"/>
+        </w:tabs>
+        <w:spacing w:after="40"/>
+        <w:ind w:firstLine="0"/>
+      </w:pPr>
+      <w:r>
+        <w:rPr>
+          <w:b w:val="0"/>
+          <w:sz w:val="26"/>
+        </w:rPr>
+        <w:t xml:space="preserve">Hình 4.10. File Jenkinsfile (pipeline-as-code) trên GitHub</w:t>
+      </w:r>
+      <w:r>
+        <w:rPr>
+          <w:b w:val="0"/>
+          <w:sz w:val="26"/>
+        </w:rPr>
+        <w:tab/>
+      </w:r>
+      <w:r>
+        <w:rPr>
+          <w:b w:val="0"/>
+          <w:sz w:val="26"/>
+        </w:rPr>
+        <w:t xml:space="preserve">15</w:t>
+      </w:r>
+    </w:p>
+    <w:p>
+      <w:pPr>
+        <w:tabs>
+          <w:tab w:val="right" w:leader="dot" w:pos="9072"/>
+        </w:tabs>
+        <w:spacing w:after="40"/>
+        <w:ind w:firstLine="0"/>
+      </w:pPr>
+      <w:r>
+        <w:rPr>
+          <w:b w:val="0"/>
+          <w:sz w:val="26"/>
+        </w:rPr>
+        <w:t xml:space="preserve">Hình 4.11. Kết quả build #3 của job devops-26-13-cicd trên Jenkins</w:t>
+      </w:r>
+      <w:r>
+        <w:rPr>
+          <w:b w:val="0"/>
+          <w:sz w:val="26"/>
+        </w:rPr>
+        <w:tab/>
+      </w:r>
+      <w:r>
+        <w:rPr>
+          <w:b w:val="0"/>
+          <w:sz w:val="26"/>
+        </w:rPr>
+        <w:t xml:space="preserve">18</w:t>
+      </w:r>
+    </w:p>
+    <w:p>
+      <w:pPr>
+        <w:tabs>
+          <w:tab w:val="right" w:leader="dot" w:pos="9072"/>
+        </w:tabs>
+        <w:spacing w:after="40"/>
+        <w:ind w:firstLine="0"/>
+      </w:pPr>
+      <w:r>
+        <w:rPr>
+          <w:b w:val="0"/>
+          <w:sz w:val="26"/>
+        </w:rPr>
+        <w:t xml:space="preserve">Hình 4.12. Ứng dụng quản lý sinh viên sau deploy tại cổng 3000</w:t>
+      </w:r>
+      <w:r>
+        <w:rPr>
+          <w:b w:val="0"/>
+          <w:sz w:val="26"/>
+        </w:rPr>
+        <w:tab/>
+      </w:r>
+      <w:r>
+        <w:rPr>
+          <w:b w:val="0"/>
+          <w:sz w:val="26"/>
+        </w:rPr>
+        <w:t xml:space="preserve">20</w:t>
+      </w:r>
+    </w:p>
+    <w:p>
+      <w:pPr>
+        <w:tabs>
+          <w:tab w:val="right" w:leader="dot" w:pos="9072"/>
+        </w:tabs>
+        <w:spacing w:after="40"/>
+        <w:ind w:firstLine="0"/>
+      </w:pPr>
+      <w:r>
+        <w:rPr>
+          <w:b w:val="0"/>
+          <w:sz w:val="26"/>
+        </w:rPr>
+        <w:t xml:space="preserve">Hình 4.13. API /api/students trả về JSON danh sách sinh viên</w:t>
+      </w:r>
+      <w:r>
+        <w:rPr>
+          <w:b w:val="0"/>
+          <w:sz w:val="26"/>
+        </w:rPr>
+        <w:tab/>
+      </w:r>
+      <w:r>
+        <w:rPr>
+          <w:b w:val="0"/>
+          <w:sz w:val="26"/>
+        </w:rPr>
+        <w:t xml:space="preserve">21</w:t>
+      </w:r>
+      <w:r>
+        <w:fldChar w:fldCharType="end"/>
       </w:r>
     </w:p>
     <w:p>
@@ -1698,6 +2329,7 @@
     </w:p>
     <w:p>
       <w:pPr>
+        <w:pStyle w:val="Caption"/>
         <w:spacing w:after="200"/>
         <w:jc w:val="center"/>
       </w:pPr>
@@ -2077,6 +2709,7 @@
     </w:p>
     <w:p>
       <w:pPr>
+        <w:pStyle w:val="Caption"/>
         <w:spacing w:after="200"/>
         <w:jc w:val="center"/>
       </w:pPr>
@@ -2293,6 +2926,7 @@
     </w:p>
     <w:p>
       <w:pPr>
+        <w:pStyle w:val="Caption"/>
         <w:spacing w:after="200"/>
         <w:jc w:val="center"/>
       </w:pPr>
@@ -2658,6 +3292,7 @@
     </w:p>
     <w:p>
       <w:pPr>
+        <w:pStyle w:val="Caption"/>
         <w:spacing w:after="200"/>
         <w:jc w:val="center"/>
       </w:pPr>
@@ -3041,6 +3676,7 @@
     </w:p>
     <w:p>
       <w:pPr>
+        <w:pStyle w:val="Caption"/>
         <w:spacing w:after="200"/>
         <w:jc w:val="center"/>
       </w:pPr>
@@ -3440,6 +4076,7 @@
     </w:p>
     <w:p>
       <w:pPr>
+        <w:pStyle w:val="Caption"/>
         <w:spacing w:after="200"/>
         <w:jc w:val="center"/>
       </w:pPr>
@@ -3508,6 +4145,7 @@
     </w:p>
     <w:p>
       <w:pPr>
+        <w:pStyle w:val="Caption"/>
         <w:spacing w:after="200"/>
         <w:jc w:val="center"/>
       </w:pPr>
@@ -3576,6 +4214,7 @@
     </w:p>
     <w:p>
       <w:pPr>
+        <w:pStyle w:val="Caption"/>
         <w:spacing w:after="200"/>
         <w:jc w:val="center"/>
       </w:pPr>
@@ -3644,6 +4283,7 @@
     </w:p>
     <w:p>
       <w:pPr>
+        <w:pStyle w:val="Caption"/>
         <w:spacing w:after="200"/>
         <w:jc w:val="center"/>
       </w:pPr>
@@ -3720,6 +4360,7 @@
     </w:p>
     <w:p>
       <w:pPr>
+        <w:pStyle w:val="Caption"/>
         <w:spacing w:after="200"/>
         <w:jc w:val="center"/>
       </w:pPr>
@@ -4922,6 +5563,7 @@
     </w:p>
     <w:p>
       <w:pPr>
+        <w:pStyle w:val="Caption"/>
         <w:spacing w:after="200"/>
         <w:jc w:val="center"/>
       </w:pPr>
@@ -5478,6 +6120,7 @@
     </w:p>
     <w:p>
       <w:pPr>
+        <w:pStyle w:val="Caption"/>
         <w:spacing w:after="200"/>
         <w:jc w:val="center"/>
       </w:pPr>
@@ -5532,6 +6175,7 @@
     </w:p>
     <w:p>
       <w:pPr>
+        <w:pStyle w:val="Caption"/>
         <w:spacing w:after="200"/>
         <w:jc w:val="center"/>
       </w:pPr>
@@ -6618,7 +7262,7 @@
     <w:qFormat/>
     <w:rsid w:val="00FC693F"/>
     <w:pPr>
-      <w:spacing w:before="0" w:after="120" w:line="340" w:lineRule="auto"/>
+      <w:spacing w:before="0" w:after="120" w:line="312" w:lineRule="auto"/>
       <w:jc w:val="both"/>
     </w:pPr>
     <w:rPr>

</xml_diff>